<commit_message>
feat(dao): lot AV-4.1 — modele LETTRE-PI (lettre d'invitation des prestations intellectuelles, source pi-ic, decalque 43/43) et demande backend ; DPAC du contrat-cadre : prix du DAO sur le compte bancaire de l'ARMP (184/184) ; piece n° 9 rendue facultative (decision du pilote du 01/10)
Co-Authored-By: Claude Opus 5.5 (1M context) <noreply@anthropic.com>
</commit_message>
<xml_diff>
--- a/docs/modeles-dao/DPAC-CC.docx
+++ b/docs/modeles-dao/DPAC-CC.docx
@@ -1193,7 +1193,7 @@
           <w:b w:val="off"/>
           <w:sz w:val="22"/>
         </w:rPr>
-        <w:t>Pour tout candidat désirant soumissionner, le règlement de la consultation (1) est retiré auprès de {{B04-DS-04}} moyennant le paiement d’un montant non remboursable de {{B04-DS-05.parLot}} libellé au nom de l’Agent comptable de l’ARMP ou au nom du régisseur de recettes de l’ARMP.</w:t>
+        <w:t>Pour tout candidat désirant soumissionner, le règlement de la consultation (1) est retiré auprès de {{B04-DS-04}} moyennant le paiement d’un montant non remboursable de {{B04-DS-05.parLot}} à verser sur le compte bancaire de l’ARMP : {{PARAM.compte-dao}}.</w:t>
       </w:r>
     </w:p>
     <w:p>
@@ -1232,7 +1232,7 @@
           <w:b w:val="off"/>
           <w:sz w:val="22"/>
         </w:rPr>
-        <w:t>Pour tout candidat désirant soumissionner, le règlement de la consultation (1) est retiré auprès de {{B04-DS-04}} moyennant le paiement d’un montant non remboursable de {{B04-DS-05.lettres}} ({{B04-DS-05}}) libellé au nom de l’Agent comptable de l’ARMP ou au nom du régisseur de recettes de l’ARMP.</w:t>
+        <w:t>Pour tout candidat désirant soumissionner, le règlement de la consultation (1) est retiré auprès de {{B04-DS-04}} moyennant le paiement d’un montant non remboursable de {{B04-DS-05.lettres}} ({{B04-DS-05}}) à verser sur le compte bancaire de l’ARMP : {{PARAM.compte-dao}}.</w:t>
       </w:r>
     </w:p>
     <w:p>

</xml_diff>

<commit_message>
feat(dao): manuel revise lot 2, tranche R10 — gabarits DPAO-F, DPAO-T, DPIC-PI et DPAC-CC resynchronises sur le backend (V113) : clause de signature de l'offre en remise electronique (soumission scellee par la plateforme = signature de l'offre ou de la proposition et de l'acte d'engagement, art. 31 ; original signe de l'AE remis avant la signature du marche), declaree en ajout dans decrire.mjs apres la clause de la remise electronique ; modeles identiques au backend octet pour octet, fidelite 252/252, 295/295, 231/231, 185/185 ; decalques Word recopies dans docs/modeles-dao
Co-Authored-By: Claude Opus 5.5 (1M context) <noreply@anthropic.com>
</commit_message>
<xml_diff>
--- a/docs/modeles-dao/DPAC-CC.docx
+++ b/docs/modeles-dao/DPAC-CC.docx
@@ -1583,6 +1583,19 @@
           <w:b w:val="off"/>
           <w:sz w:val="22"/>
         </w:rPr>
+        <w:t>La soumission par la plateforme, effectuée depuis le compte authentifié du candidat et scellée par celle-ci, vaut signature de l'offre et de l'acte d'engagement au sens de l'article 31 du Code. L'attributaire remet l'original signé de son acte d'engagement avant la signature du marché.</w:t>
+      </w:r>
+    </w:p>
+    <w:p>
+      <w:pPr>
+        <w:spacing w:after="120"/>
+        <w:jc w:val="both"/>
+      </w:pPr>
+      <w:r>
+        <w:rPr>
+          <w:b w:val="off"/>
+          <w:sz w:val="22"/>
+        </w:rPr>
         <w:t>{{FINSI:B04-SE}}</w:t>
       </w:r>
     </w:p>

</xml_diff>